<commit_message>
Add OOAD appendix to the SRS: domain model, design model, sequence diagram
Extends Appendix A beyond the existing use-case diagram with a class
diagram of the five analysis-result dataclasses (MarketData,
RiskProfile, CyclePhase, RegimeCorrelation, ForecastResult), a service-
class collaboration diagram mapping each src/ module to a class with
its operations, and a sequence diagram tracing the "Assess Volatility
& Risk" use case through both. Diagrams are generated to match the
visual style of the existing architecture figures.

Co-Authored-By: Claude Sonnet 5 <noreply@anthropic.com>
</commit_message>
<xml_diff>
--- a/docs/Cryptocurrency_Market_Analysis_System_SRS.docx
+++ b/docs/Cryptocurrency_Market_Analysis_System_SRS.docx
@@ -2030,6 +2030,102 @@
           <w:szCs w:val="21"/>
         </w:rPr>
         <w:t xml:space="preserve">9</w:t>
+      </w:r>
+    </w:p>
+    <w:p>
+      <w:pPr>
+        <w:tabs>
+          <w:tab w:val="right" w:pos="9026" w:leader="dot"/>
+        </w:tabs>
+        <w:spacing w:after="26" w:line="260"/>
+        <w:ind w:left="380"/>
+      </w:pPr>
+      <w:r>
+        <w:rPr>
+          <w:b w:val="false"/>
+          <w:bCs w:val="false"/>
+          <w:color w:val="374151"/>
+          <w:sz w:val="21"/>
+          <w:szCs w:val="21"/>
+        </w:rPr>
+        <w:t xml:space="preserve">A.1 Domain Model (Class Diagram)</w:t>
+      </w:r>
+      <w:r>
+        <w:tab/>
+      </w:r>
+      <w:r>
+        <w:rPr>
+          <w:b w:val="false"/>
+          <w:bCs w:val="false"/>
+          <w:color w:val="374151"/>
+          <w:sz w:val="21"/>
+          <w:szCs w:val="21"/>
+        </w:rPr>
+        <w:t xml:space="preserve">10</w:t>
+      </w:r>
+    </w:p>
+    <w:p>
+      <w:pPr>
+        <w:tabs>
+          <w:tab w:val="right" w:pos="9026" w:leader="dot"/>
+        </w:tabs>
+        <w:spacing w:after="26" w:line="260"/>
+        <w:ind w:left="380"/>
+      </w:pPr>
+      <w:r>
+        <w:rPr>
+          <w:b w:val="false"/>
+          <w:bCs w:val="false"/>
+          <w:color w:val="374151"/>
+          <w:sz w:val="21"/>
+          <w:szCs w:val="21"/>
+        </w:rPr>
+        <w:t xml:space="preserve">A.2 Design Model (Class Diagram)</w:t>
+      </w:r>
+      <w:r>
+        <w:tab/>
+      </w:r>
+      <w:r>
+        <w:rPr>
+          <w:b w:val="false"/>
+          <w:bCs w:val="false"/>
+          <w:color w:val="374151"/>
+          <w:sz w:val="21"/>
+          <w:szCs w:val="21"/>
+        </w:rPr>
+        <w:t xml:space="preserve">10</w:t>
+      </w:r>
+    </w:p>
+    <w:p>
+      <w:pPr>
+        <w:tabs>
+          <w:tab w:val="right" w:pos="9026" w:leader="dot"/>
+        </w:tabs>
+        <w:spacing w:after="26" w:line="260"/>
+        <w:ind w:left="380"/>
+      </w:pPr>
+      <w:r>
+        <w:rPr>
+          <w:b w:val="false"/>
+          <w:bCs w:val="false"/>
+          <w:color w:val="374151"/>
+          <w:sz w:val="21"/>
+          <w:szCs w:val="21"/>
+        </w:rPr>
+        <w:t xml:space="preserve">A.3 Sequence Diagram</w:t>
+      </w:r>
+      <w:r>
+        <w:tab/>
+      </w:r>
+      <w:r>
+        <w:rPr>
+          <w:b w:val="false"/>
+          <w:bCs w:val="false"/>
+          <w:color w:val="374151"/>
+          <w:sz w:val="21"/>
+          <w:szCs w:val="21"/>
+        </w:rPr>
+        <w:t xml:space="preserve">11</w:t>
       </w:r>
     </w:p>
     <w:p>
@@ -7303,6 +7399,312 @@
           <w:szCs w:val="21"/>
         </w:rPr>
         <w:t xml:space="preserve">Primary use cases: view the market overview; assess volatility and risk; identify the market cycle; analyse correlation; forecast prices; monitor sentiment and on-chain activity; and configure and refresh data. The External Data Providers actor supplies the market, sentiment, and on-chain data consumed during ingestion.</w:t>
+      </w:r>
+    </w:p>
+    <w:p>
+      <w:pPr>
+        <w:pStyle w:val="Heading2"/>
+        <w:spacing w:after="100" w:before="220"/>
+      </w:pPr>
+      <w:r>
+        <w:rPr>
+          <w:b/>
+          <w:bCs/>
+          <w:color w:val="1F4E9E"/>
+          <w:sz w:val="24"/>
+          <w:szCs w:val="24"/>
+        </w:rPr>
+        <w:t xml:space="preserve">A.1 Domain Model (Class Diagram)</w:t>
+      </w:r>
+    </w:p>
+    <w:p>
+      <w:pPr>
+        <w:spacing w:after="120" w:line="276"/>
+      </w:pPr>
+      <w:r>
+        <w:rPr>
+          <w:sz w:val="21"/>
+          <w:szCs w:val="21"/>
+        </w:rPr>
+        <w:t xml:space="preserve">The use-case diagram in Figure 3 identifies what the system does; the class diagram in Figure 4 identifies the things it does it with. Each of the five classes below is a Python dataclass returned by exactly one analysis function — MarketData by the orchestration layer, and RiskProfile, CyclePhase, RegimeCorrelation and ForecastResult by the volatility, cycle, correlation and forecasting modules respectively (Sections 4.2–4.5). They are the nouns of the domain: an investor reasons about “a RiskProfile for BTC” or “this coin's CyclePhase,” not about the dataframes and functions that produced them.</w:t>
+      </w:r>
+    </w:p>
+    <w:p>
+      <w:pPr>
+        <w:spacing w:after="40" w:before="120"/>
+        <w:jc w:val="center"/>
+      </w:pPr>
+      <w:r>
+        <w:drawing>
+          <wp:inline distT="0" distB="0" distL="0" distR="0">
+            <wp:extent cx="5486400" cy="3062976"/>
+            <wp:effectExtent t="0" r="0" b="0" l="0"/>
+            <wp:docPr id="1" name="" descr="" title=""/>
+            <wp:cNvGraphicFramePr>
+              <a:graphicFrameLocks xmlns:a="http://schemas.openxmlformats.org/drawingml/2006/main" noChangeAspect="1"/>
+            </wp:cNvGraphicFramePr>
+            <a:graphic xmlns:a="http://schemas.openxmlformats.org/drawingml/2006/main">
+              <a:graphicData uri="http://schemas.openxmlformats.org/drawingml/2006/picture">
+                <pic:pic xmlns:pic="http://schemas.openxmlformats.org/drawingml/2006/picture">
+                  <pic:nvPicPr>
+                    <pic:cNvPr id="0" name="" descr=""/>
+                    <pic:cNvPicPr>
+                      <a:picLocks noChangeAspect="1" noChangeArrowheads="1"/>
+                    </pic:cNvPicPr>
+                  </pic:nvPicPr>
+                  <pic:blipFill>
+                    <a:blip r:embed="rId13" cstate="none"/>
+                    <a:srcRect/>
+                    <a:stretch>
+                      <a:fillRect/>
+                    </a:stretch>
+                  </pic:blipFill>
+                  <pic:spPr bwMode="auto">
+                    <a:xfrm>
+                      <a:off x="0" y="0"/>
+                      <a:ext cx="5486400" cy="3062976"/>
+                    </a:xfrm>
+                    <a:prstGeom prst="rect">
+                      <a:avLst/>
+                    </a:prstGeom>
+                  </pic:spPr>
+                </pic:pic>
+              </a:graphicData>
+            </a:graphic>
+          </wp:inline>
+        </w:drawing>
+      </w:r>
+    </w:p>
+    <w:p>
+      <w:pPr>
+        <w:spacing w:after="160"/>
+        <w:jc w:val="center"/>
+      </w:pPr>
+      <w:r>
+        <w:rPr>
+          <w:i/>
+          <w:iCs/>
+          <w:color w:val="6B7280"/>
+          <w:sz w:val="18"/>
+          <w:szCs w:val="18"/>
+        </w:rPr>
+        <w:t xml:space="preserve">Figure 4. Domain model — class diagram of the analysis-layer value objects.</w:t>
+      </w:r>
+    </w:p>
+    <w:p>
+      <w:pPr>
+        <w:spacing w:after="120" w:line="276"/>
+      </w:pPr>
+      <w:r>
+        <w:rPr>
+          <w:sz w:val="21"/>
+          <w:szCs w:val="21"/>
+        </w:rPr>
+        <w:t xml:space="preserve">All five are immutable once constructed: an analysis function builds one instance from a price series and returns it, and nothing downstream mutates it. This mirrors the functional style of the analysis layer (Section 2.5) in object-oriented terms — the classes hold state, but that state is write-once, which keeps a value safe to cache, compare across reruns, and hand to the presentation layer without defensive copying.</w:t>
+      </w:r>
+    </w:p>
+    <w:p>
+      <w:pPr>
+        <w:pStyle w:val="Heading2"/>
+        <w:spacing w:after="100" w:before="220"/>
+      </w:pPr>
+      <w:r>
+        <w:rPr>
+          <w:b/>
+          <w:bCs/>
+          <w:color w:val="1F4E9E"/>
+          <w:sz w:val="24"/>
+          <w:szCs w:val="24"/>
+        </w:rPr>
+        <w:t xml:space="preserve">A.2 Design Model (Class Diagram)</w:t>
+      </w:r>
+    </w:p>
+    <w:p>
+      <w:pPr>
+        <w:spacing w:after="120" w:line="276"/>
+      </w:pPr>
+      <w:r>
+        <w:rPr>
+          <w:sz w:val="21"/>
+          <w:szCs w:val="21"/>
+        </w:rPr>
+        <w:t xml:space="preserve">Figure 5 completes the analysis model by showing which class is responsible for creating each domain object and how control flows between them. Because the codebase is organised as cohesive Python modules rather than instantiable classes, each module is modelled here as a service class (stereotype «module») whose public functions become its operations — a standard technique for expressing a functional/procedural design in UML without misrepresenting the implementation. The mapping is exact: every class name in the diagram corresponds to one file under src/, listed in its «module» tag.</w:t>
+      </w:r>
+    </w:p>
+    <w:p>
+      <w:pPr>
+        <w:spacing w:after="40" w:before="120"/>
+        <w:jc w:val="center"/>
+      </w:pPr>
+      <w:r>
+        <w:drawing>
+          <wp:inline distT="0" distB="0" distL="0" distR="0">
+            <wp:extent cx="5486400" cy="4151467"/>
+            <wp:effectExtent t="0" r="0" b="0" l="0"/>
+            <wp:docPr id="1" name="" descr="" title=""/>
+            <wp:cNvGraphicFramePr>
+              <a:graphicFrameLocks xmlns:a="http://schemas.openxmlformats.org/drawingml/2006/main" noChangeAspect="1"/>
+            </wp:cNvGraphicFramePr>
+            <a:graphic xmlns:a="http://schemas.openxmlformats.org/drawingml/2006/main">
+              <a:graphicData uri="http://schemas.openxmlformats.org/drawingml/2006/picture">
+                <pic:pic xmlns:pic="http://schemas.openxmlformats.org/drawingml/2006/picture">
+                  <pic:nvPicPr>
+                    <pic:cNvPr id="0" name="" descr=""/>
+                    <pic:cNvPicPr>
+                      <a:picLocks noChangeAspect="1" noChangeArrowheads="1"/>
+                    </pic:cNvPicPr>
+                  </pic:nvPicPr>
+                  <pic:blipFill>
+                    <a:blip r:embed="rId14" cstate="none"/>
+                    <a:srcRect/>
+                    <a:stretch>
+                      <a:fillRect/>
+                    </a:stretch>
+                  </pic:blipFill>
+                  <pic:spPr bwMode="auto">
+                    <a:xfrm>
+                      <a:off x="0" y="0"/>
+                      <a:ext cx="5486400" cy="4151467"/>
+                    </a:xfrm>
+                    <a:prstGeom prst="rect">
+                      <a:avLst/>
+                    </a:prstGeom>
+                  </pic:spPr>
+                </pic:pic>
+              </a:graphicData>
+            </a:graphic>
+          </wp:inline>
+        </w:drawing>
+      </w:r>
+    </w:p>
+    <w:p>
+      <w:pPr>
+        <w:spacing w:after="160"/>
+        <w:jc w:val="center"/>
+      </w:pPr>
+      <w:r>
+        <w:rPr>
+          <w:i/>
+          <w:iCs/>
+          <w:color w:val="6B7280"/>
+          <w:sz w:val="18"/>
+          <w:szCs w:val="18"/>
+        </w:rPr>
+        <w:t xml:space="preserve">Figure 5. Design model — service classes and their collaborations.</w:t>
+      </w:r>
+    </w:p>
+    <w:p>
+      <w:pPr>
+        <w:spacing w:after="120" w:line="276"/>
+      </w:pPr>
+      <w:r>
+        <w:rPr>
+          <w:sz w:val="21"/>
+          <w:szCs w:val="21"/>
+        </w:rPr>
+        <w:t xml:space="preserve">Three responsibilities are worth calling out. First, MarketDataPipeline is the single class that knows about every data loader; DashboardApp never talks to CryptoLoader or MacroLoader directly, which keeps the presentation layer free of ingestion detail. Second, CacheManager sits between the pipeline and each loader so that a cache hit never touches the network. Third, each loader falls back to SampleDataGenerator on failure rather than raising, which is what lets the dashboard “never raise for network reasons” (Section 4.1) — the fallback is a designed collaboration, not an afterthought.</w:t>
+      </w:r>
+    </w:p>
+    <w:p>
+      <w:pPr>
+        <w:pStyle w:val="Heading2"/>
+        <w:spacing w:after="100" w:before="220"/>
+      </w:pPr>
+      <w:r>
+        <w:rPr>
+          <w:b/>
+          <w:bCs/>
+          <w:color w:val="1F4E9E"/>
+          <w:sz w:val="24"/>
+          <w:szCs w:val="24"/>
+        </w:rPr>
+        <w:t xml:space="preserve">A.3 Sequence Diagram</w:t>
+      </w:r>
+    </w:p>
+    <w:p>
+      <w:pPr>
+        <w:spacing w:after="120" w:line="276"/>
+      </w:pPr>
+      <w:r>
+        <w:rPr>
+          <w:sz w:val="21"/>
+          <w:szCs w:val="21"/>
+        </w:rPr>
+        <w:t xml:space="preserve">Figure 6 traces one use case from Figure 3 — Assess Volatility and Risk — end to end through the classes introduced in Figure 5, showing both the cache-miss path (a live CoinGecko fetch) and how the resulting RiskProfile is assembled and returned. A cache-hit run is the same diagram with the CryptoLoader lifeline skipped: CacheManager returns the stored DataFrame directly.</w:t>
+      </w:r>
+    </w:p>
+    <w:p>
+      <w:pPr>
+        <w:spacing w:after="40" w:before="120"/>
+        <w:jc w:val="center"/>
+      </w:pPr>
+      <w:r>
+        <w:drawing>
+          <wp:inline distT="0" distB="0" distL="0" distR="0">
+            <wp:extent cx="5486400" cy="3119382"/>
+            <wp:effectExtent t="0" r="0" b="0" l="0"/>
+            <wp:docPr id="1" name="" descr="" title=""/>
+            <wp:cNvGraphicFramePr>
+              <a:graphicFrameLocks xmlns:a="http://schemas.openxmlformats.org/drawingml/2006/main" noChangeAspect="1"/>
+            </wp:cNvGraphicFramePr>
+            <a:graphic xmlns:a="http://schemas.openxmlformats.org/drawingml/2006/main">
+              <a:graphicData uri="http://schemas.openxmlformats.org/drawingml/2006/picture">
+                <pic:pic xmlns:pic="http://schemas.openxmlformats.org/drawingml/2006/picture">
+                  <pic:nvPicPr>
+                    <pic:cNvPr id="0" name="" descr=""/>
+                    <pic:cNvPicPr>
+                      <a:picLocks noChangeAspect="1" noChangeArrowheads="1"/>
+                    </pic:cNvPicPr>
+                  </pic:nvPicPr>
+                  <pic:blipFill>
+                    <a:blip r:embed="rId15" cstate="none"/>
+                    <a:srcRect/>
+                    <a:stretch>
+                      <a:fillRect/>
+                    </a:stretch>
+                  </pic:blipFill>
+                  <pic:spPr bwMode="auto">
+                    <a:xfrm>
+                      <a:off x="0" y="0"/>
+                      <a:ext cx="5486400" cy="3119382"/>
+                    </a:xfrm>
+                    <a:prstGeom prst="rect">
+                      <a:avLst/>
+                    </a:prstGeom>
+                  </pic:spPr>
+                </pic:pic>
+              </a:graphicData>
+            </a:graphic>
+          </wp:inline>
+        </w:drawing>
+      </w:r>
+    </w:p>
+    <w:p>
+      <w:pPr>
+        <w:spacing w:after="160"/>
+        <w:jc w:val="center"/>
+      </w:pPr>
+      <w:r>
+        <w:rPr>
+          <w:i/>
+          <w:iCs/>
+          <w:color w:val="6B7280"/>
+          <w:sz w:val="18"/>
+          <w:szCs w:val="18"/>
+        </w:rPr>
+        <w:t xml:space="preserve">Figure 6. Sequence diagram — “Assess Volatility &amp; Risk” use case.</w:t>
+      </w:r>
+    </w:p>
+    <w:p>
+      <w:pPr>
+        <w:spacing w:after="120" w:line="276"/>
+      </w:pPr>
+      <w:r>
+        <w:rPr>
+          <w:sz w:val="21"/>
+          <w:szCs w:val="21"/>
+        </w:rPr>
+        <w:t xml:space="preserve">The diagram also documents where resilience is enforced: CacheManager decides whether CryptoLoader runs at all (Section 4.1's 6-hour TTL), and VolatilityAnalyzer is only ever called once a MarketData bundle exists, so a downstream analyser never has to handle a missing feed itself — that concern is resolved once, in the orchestration layer, before analysis begins.</w:t>
       </w:r>
     </w:p>
     <w:sectPr>

</xml_diff>